<commit_message>
Complete excellent-level FTP reliability and tests
</commit_message>
<xml_diff>
--- a/output/report/Hybrid_FTP_Technical_Report.docx
+++ b/output/report/Hybrid_FTP_Technical_Report.docx
@@ -541,7 +541,7 @@
           <w:color w:val="111827"/>
           <w:sz w:val="22"/>
         </w:rPr>
-        <w:t>Verification includes eight automated protocol/RDT tests and live end-to-end demonstrations of Passive upload, Active upload, Active download, directory listing, append, unique upload, and cross-host hash equality.</w:t>
+        <w:t>Verification includes twelve automated protocol, RDT, and end-to-end integration tests and live end-to-end demonstrations of Passive upload, Active upload, Active download, directory listing, append, unique upload, and cross-host hash equality.</w:t>
       </w:r>
     </w:p>
     <w:p>
@@ -8163,7 +8163,9 @@
                 <w:color w:val="243447"/>
                 <w:sz w:val="17"/>
               </w:rPr>
-              <w:t>Ran 8 tests in approximately 1.7 seconds</w:t>
+              <w:t>Ran 12 tests (protocol, RDT failure recovery, and FTP integration)</w:t>
+              <w:br/>
+              <w:t>OK</w:t>
             </w:r>
             <w:r>
               <w:br/>
@@ -8946,6 +8948,134 @@
                 <w:color w:val="111827"/>
                 <w:sz w:val="18"/>
               </w:rPr>
+              <w:t>PASS</w:t>
+            </w:r>
+          </w:p>
+        </w:tc>
+      </w:tr>
+      <w:tr>
+        <w:tc>
+          <w:tcPr>
+            <w:tcW w:type="dxa" w:w="1800"/>
+          </w:tcPr>
+          <w:p>
+            <w:r>
+              <w:t>Total packet loss</w:t>
+            </w:r>
+          </w:p>
+        </w:tc>
+        <w:tc>
+          <w:tcPr>
+            <w:tcW w:type="dxa" w:w="5860"/>
+          </w:tcPr>
+          <w:p>
+            <w:r>
+              <w:t>100% loss reaches retry limit and marks transfer FAILED</w:t>
+            </w:r>
+          </w:p>
+        </w:tc>
+        <w:tc>
+          <w:tcPr>
+            <w:tcW w:type="dxa" w:w="1700"/>
+          </w:tcPr>
+          <w:p>
+            <w:r>
+              <w:t>PASS</w:t>
+            </w:r>
+          </w:p>
+        </w:tc>
+      </w:tr>
+      <w:tr>
+        <w:tc>
+          <w:tcPr>
+            <w:tcW w:type="dxa" w:w="1800"/>
+          </w:tcPr>
+          <w:p>
+            <w:r>
+              <w:t>Safe failure</w:t>
+            </w:r>
+          </w:p>
+        </w:tc>
+        <w:tc>
+          <w:tcPr>
+            <w:tcW w:type="dxa" w:w="5860"/>
+          </w:tcPr>
+          <w:p>
+            <w:r>
+              <w:t>Hash failure preserves the previous destination and removes .part</w:t>
+            </w:r>
+          </w:p>
+        </w:tc>
+        <w:tc>
+          <w:tcPr>
+            <w:tcW w:type="dxa" w:w="1700"/>
+          </w:tcPr>
+          <w:p>
+            <w:r>
+              <w:t>PASS</w:t>
+            </w:r>
+          </w:p>
+        </w:tc>
+      </w:tr>
+      <w:tr>
+        <w:tc>
+          <w:tcPr>
+            <w:tcW w:type="dxa" w:w="1800"/>
+          </w:tcPr>
+          <w:p>
+            <w:r>
+              <w:t>FTP integration</w:t>
+            </w:r>
+          </w:p>
+        </w:tc>
+        <w:tc>
+          <w:tcPr>
+            <w:tcW w:type="dxa" w:w="5860"/>
+          </w:tcPr>
+          <w:p>
+            <w:r>
+              <w:t>PASV/PORT, STOR/RETR, NLST, APPE, STOU, HELP, framing, two clients</w:t>
+            </w:r>
+          </w:p>
+        </w:tc>
+        <w:tc>
+          <w:tcPr>
+            <w:tcW w:type="dxa" w:w="1700"/>
+          </w:tcPr>
+          <w:p>
+            <w:r>
+              <w:t>PASS</w:t>
+            </w:r>
+          </w:p>
+        </w:tc>
+      </w:tr>
+      <w:tr>
+        <w:tc>
+          <w:tcPr>
+            <w:tcW w:type="dxa" w:w="1800"/>
+          </w:tcPr>
+          <w:p>
+            <w:r>
+              <w:t>Live ABOR</w:t>
+            </w:r>
+          </w:p>
+        </w:tc>
+        <w:tc>
+          <w:tcPr>
+            <w:tcW w:type="dxa" w:w="5860"/>
+          </w:tcPr>
+          <w:p>
+            <w:r>
+              <w:t>TCP ABOR cancels an 8 MiB download and removes temporary data</w:t>
+            </w:r>
+          </w:p>
+        </w:tc>
+        <w:tc>
+          <w:tcPr>
+            <w:tcW w:type="dxa" w:w="1700"/>
+          </w:tcPr>
+          <w:p>
+            <w:r>
               <w:t>PASS</w:t>
             </w:r>
           </w:p>
@@ -10574,6 +10704,12 @@
         </w:tc>
       </w:tr>
     </w:tbl>
+    <w:p>
+      <w:pPr/>
+      <w:r>
+        <w:t>Fault-injection demo (PowerShell): set RDT_LOSS_RATE=0.10, RDT_CORRUPTION_RATE=0.05, and RDT_DUPLICATE_RATE=0.05 before starting the server and client. The CLI prints progress, retry count, and duration.</w:t>
+      </w:r>
+    </w:p>
     <w:p>
       <w:pPr>
         <w:spacing w:after="20"/>

</xml_diff>